<commit_message>
update and rename file
</commit_message>
<xml_diff>
--- a/doc/Linux-ubuntu24操作(上).docx
+++ b/doc/Linux-ubuntu24操作(上).docx
@@ -37071,9 +37071,6 @@
     <w:p>
       <w:pPr>
         <w:pStyle w:val="tony-f7"/>
-        <w:rPr>
-          <w:rFonts w:hint="eastAsia"/>
-        </w:rPr>
       </w:pPr>
       <w:r>
         <w:rPr>
@@ -37192,7 +37189,7 @@
       <w:pPr>
         <w:pStyle w:val="tony-f1"/>
         <w:rPr>
-          <w:rFonts w:eastAsiaTheme="minorEastAsia" w:hint="eastAsia"/>
+          <w:rFonts w:eastAsiaTheme="minorEastAsia"/>
           <w:color w:val="EE0000"/>
         </w:rPr>
       </w:pPr>
@@ -37345,7 +37342,6 @@
       <w:pPr>
         <w:pStyle w:val="tony-f1"/>
         <w:rPr>
-          <w:rFonts w:hint="eastAsia"/>
           <w:color w:val="EE0000"/>
           <w:sz w:val="32"/>
           <w:szCs w:val="28"/>
@@ -37486,6 +37482,30 @@
         </w:rPr>
         <w:t>:</w:t>
       </w:r>
+      <w:r>
+        <w:rPr>
+          <w:rFonts w:hint="eastAsia"/>
+        </w:rPr>
+        <w:t xml:space="preserve"> </w:t>
+      </w:r>
+      <w:r>
+        <w:rPr>
+          <w:rFonts w:hint="eastAsia"/>
+        </w:rPr>
+        <w:t>(</w:t>
+      </w:r>
+      <w:r>
+        <w:rPr>
+          <w:rFonts w:hint="eastAsia"/>
+        </w:rPr>
+        <w:t>可成功</w:t>
+      </w:r>
+      <w:r>
+        <w:rPr>
+          <w:rFonts w:hint="eastAsia"/>
+        </w:rPr>
+        <w:t>)</w:t>
+      </w:r>
     </w:p>
     <w:p>
       <w:pPr>
@@ -37609,9 +37629,6 @@
     <w:p>
       <w:pPr>
         <w:pStyle w:val="tony-f1"/>
-        <w:rPr>
-          <w:rFonts w:hint="eastAsia"/>
-        </w:rPr>
       </w:pPr>
       <w:r>
         <w:rPr>
@@ -37653,9 +37670,6 @@
     <w:p>
       <w:pPr>
         <w:pStyle w:val="tony-f1"/>
-        <w:rPr>
-          <w:rFonts w:hint="eastAsia"/>
-        </w:rPr>
       </w:pPr>
       <w:r>
         <w:t>[</w:t>
@@ -38963,9 +38977,6 @@
     <w:p>
       <w:pPr>
         <w:pStyle w:val="tony-f7"/>
-        <w:rPr>
-          <w:rFonts w:hint="eastAsia"/>
-        </w:rPr>
       </w:pPr>
       <w:r>
         <w:rPr>
@@ -39314,6 +39325,24 @@
         </w:rPr>
         <w:t>範例：</w:t>
       </w:r>
+      <w:r>
+        <w:rPr>
+          <w:rFonts w:hint="eastAsia"/>
+        </w:rPr>
+        <w:t>(</w:t>
+      </w:r>
+      <w:r>
+        <w:rPr>
+          <w:rFonts w:hint="eastAsia"/>
+        </w:rPr>
+        <w:t>待確認</w:t>
+      </w:r>
+      <w:r>
+        <w:rPr>
+          <w:rFonts w:hint="eastAsia"/>
+        </w:rPr>
+        <w:t>)</w:t>
+      </w:r>
     </w:p>
     <w:p>
       <w:pPr>
@@ -39518,6 +39547,9 @@
     <w:p>
       <w:pPr>
         <w:pStyle w:val="tony-f1"/>
+        <w:rPr>
+          <w:rFonts w:hint="eastAsia"/>
+        </w:rPr>
       </w:pPr>
       <w:r>
         <w:t>[</w:t>
@@ -39581,6 +39613,72 @@
       </w:r>
       <w:r>
         <w:t>5</w:t>
+      </w:r>
+      <w:r>
+        <w:rPr>
+          <w:rFonts w:hint="eastAsia"/>
+        </w:rPr>
+        <w:t xml:space="preserve"> (</w:t>
+      </w:r>
+      <w:r>
+        <w:rPr>
+          <w:rFonts w:hint="eastAsia"/>
+        </w:rPr>
+        <w:t>以上沒作用，只有在</w:t>
+      </w:r>
+      <w:r>
+        <w:rPr>
+          <w:rFonts w:hint="eastAsia"/>
+        </w:rPr>
+        <w:t>/etc/group</w:t>
+      </w:r>
+      <w:r>
+        <w:rPr>
+          <w:rFonts w:hint="eastAsia"/>
+        </w:rPr>
+        <w:t>看到</w:t>
+      </w:r>
+      <w:r>
+        <w:rPr>
+          <w:rFonts w:hint="eastAsia"/>
+        </w:rPr>
+        <w:t>student group</w:t>
+      </w:r>
+      <w:r>
+        <w:rPr>
+          <w:rFonts w:hint="eastAsia"/>
+        </w:rPr>
+        <w:t>有</w:t>
+      </w:r>
+      <w:r>
+        <w:rPr>
+          <w:rFonts w:hint="eastAsia"/>
+        </w:rPr>
+        <w:t>u3,4,5</w:t>
+      </w:r>
+      <w:r>
+        <w:rPr>
+          <w:rFonts w:hint="eastAsia"/>
+        </w:rPr>
+        <w:t>，但</w:t>
+      </w:r>
+      <w:r>
+        <w:rPr>
+          <w:rFonts w:hint="eastAsia"/>
+        </w:rPr>
+        <w:t>passwd</w:t>
+      </w:r>
+      <w:r>
+        <w:rPr>
+          <w:rFonts w:hint="eastAsia"/>
+        </w:rPr>
+        <w:t>卻沒變</w:t>
+      </w:r>
+      <w:r>
+        <w:rPr>
+          <w:rFonts w:hint="eastAsia"/>
+        </w:rPr>
+        <w:t>)</w:t>
       </w:r>
     </w:p>
     <w:p>
@@ -40281,9 +40379,6 @@
     <w:p>
       <w:pPr>
         <w:pStyle w:val="tony-f7"/>
-        <w:rPr>
-          <w:rFonts w:hint="eastAsia"/>
-        </w:rPr>
       </w:pPr>
       <w:r>
         <w:rPr>
@@ -40329,6 +40424,7 @@
         <w:pStyle w:val="tony-f5"/>
       </w:pPr>
       <w:r>
+        <w:lastRenderedPageBreak/>
         <w:t xml:space="preserve">groupadd </w:t>
       </w:r>
       <w:r>
@@ -40373,7 +40469,6 @@
         <w:rPr>
           <w:rFonts w:ascii="標楷體" w:hAnsi="標楷體" w:hint="eastAsia"/>
         </w:rPr>
-        <w:lastRenderedPageBreak/>
         <w:t>※</w:t>
       </w:r>
       <w:r>
@@ -41071,6 +41166,7 @@
         <w:pStyle w:val="tony-f1"/>
       </w:pPr>
       <w:r>
+        <w:lastRenderedPageBreak/>
         <w:t>[</w:t>
       </w:r>
       <w:r>
@@ -41130,7 +41226,6 @@
         <w:pStyle w:val="tony-f1"/>
       </w:pPr>
       <w:r>
-        <w:lastRenderedPageBreak/>
         <w:t>[</w:t>
       </w:r>
       <w:r>
@@ -42005,6 +42100,7 @@
               <w:rPr>
                 <w:rFonts w:hint="eastAsia"/>
               </w:rPr>
+              <w:lastRenderedPageBreak/>
               <w:t>-d</w:t>
             </w:r>
           </w:p>
@@ -42031,14 +42127,7 @@
               <w:rPr>
                 <w:rFonts w:hint="eastAsia"/>
               </w:rPr>
-              <w:t>檔中的使用者密碼，如此一來，該使用者即可不需</w:t>
-            </w:r>
-            <w:r>
-              <w:rPr>
-                <w:rFonts w:hint="eastAsia"/>
-              </w:rPr>
-              <w:lastRenderedPageBreak/>
-              <w:t>輸入密碼而能登入系統</w:t>
+              <w:t>檔中的使用者密碼，如此一來，該使用者即可不需輸入密碼而能登入系統</w:t>
             </w:r>
           </w:p>
         </w:tc>
@@ -42060,7 +42149,6 @@
               <w:rPr>
                 <w:rFonts w:hint="eastAsia"/>
               </w:rPr>
-              <w:lastRenderedPageBreak/>
               <w:t>-S</w:t>
             </w:r>
           </w:p>
@@ -42952,6 +43040,7 @@
         <w:rPr>
           <w:rFonts w:hint="eastAsia"/>
         </w:rPr>
+        <w:lastRenderedPageBreak/>
         <w:t xml:space="preserve">su - </w:t>
       </w:r>
       <w:r>
@@ -42969,7 +43058,6 @@
         <w:rPr>
           <w:rFonts w:hint="eastAsia"/>
         </w:rPr>
-        <w:lastRenderedPageBreak/>
         <w:t>所以建議大家</w:t>
       </w:r>
       <w:r>
@@ -43459,6 +43547,7 @@
               <w:rPr>
                 <w:rFonts w:hint="eastAsia"/>
               </w:rPr>
+              <w:lastRenderedPageBreak/>
               <w:t>-</w:t>
             </w:r>
           </w:p>
@@ -43476,14 +43565,7 @@
               <w:rPr>
                 <w:rFonts w:hint="eastAsia"/>
               </w:rPr>
-              <w:t>代表的是檔案，包括一般檔案、硬式連結檔、可執</w:t>
-            </w:r>
-            <w:r>
-              <w:rPr>
-                <w:rFonts w:hint="eastAsia"/>
-              </w:rPr>
-              <w:lastRenderedPageBreak/>
-              <w:t>行檔、壓縮檔等</w:t>
+              <w:t>代表的是檔案，包括一般檔案、硬式連結檔、可執行檔、壓縮檔等</w:t>
             </w:r>
           </w:p>
         </w:tc>
@@ -43507,7 +43589,6 @@
               <w:rPr>
                 <w:rFonts w:hint="eastAsia"/>
               </w:rPr>
-              <w:lastRenderedPageBreak/>
               <w:t>d</w:t>
             </w:r>
           </w:p>
@@ -44458,6 +44539,7 @@
         <w:rPr>
           <w:rFonts w:hint="eastAsia"/>
         </w:rPr>
+        <w:lastRenderedPageBreak/>
         <w:t>指令</w:t>
       </w:r>
       <w:r>
@@ -44490,7 +44572,6 @@
         <w:rPr>
           <w:rFonts w:hint="eastAsia"/>
         </w:rPr>
-        <w:lastRenderedPageBreak/>
         <w:t>指令語法：</w:t>
       </w:r>
     </w:p>
@@ -45408,7 +45489,6 @@
         <w:rPr>
           <w:rFonts w:hint="eastAsia"/>
         </w:rPr>
-        <w:lastRenderedPageBreak/>
         <w:t>數字模式：</w:t>
       </w:r>
     </w:p>
@@ -46524,6 +46604,7 @@
         <w:pStyle w:val="tony-f1"/>
       </w:pPr>
       <w:r>
+        <w:lastRenderedPageBreak/>
         <w:t>[</w:t>
       </w:r>
       <w:r>
@@ -46571,7 +46652,6 @@
         <w:pStyle w:val="tony-f1"/>
       </w:pPr>
       <w:r>
-        <w:lastRenderedPageBreak/>
         <w:t>[</w:t>
       </w:r>
       <w:r>
@@ -47363,9 +47443,6 @@
     <w:p>
       <w:pPr>
         <w:pStyle w:val="tony-f1"/>
-        <w:rPr>
-          <w:rFonts w:hint="eastAsia"/>
-        </w:rPr>
       </w:pPr>
       <w:r>
         <w:t>[</w:t>
@@ -47633,6 +47710,7 @@
         <w:pStyle w:val="tony-f1"/>
       </w:pPr>
       <w:r>
+        <w:lastRenderedPageBreak/>
         <w:t>[</w:t>
       </w:r>
       <w:r>
@@ -47722,7 +47800,6 @@
         <w:rPr>
           <w:rFonts w:hint="eastAsia"/>
         </w:rPr>
-        <w:lastRenderedPageBreak/>
         <w:t>(</w:t>
       </w:r>
       <w:r>
@@ -48777,6 +48854,7 @@
         <w:pStyle w:val="tony-f1"/>
       </w:pPr>
       <w:r>
+        <w:lastRenderedPageBreak/>
         <w:t>[</w:t>
       </w:r>
       <w:r>
@@ -48830,7 +48908,6 @@
         <w:pStyle w:val="tony-f1"/>
       </w:pPr>
       <w:r>
-        <w:lastRenderedPageBreak/>
         <w:t>[</w:t>
       </w:r>
       <w:r>

</xml_diff>